<commit_message>
Trigonometric and Inverse Trigonometric Functions help topic added
</commit_message>
<xml_diff>
--- a/docs/help_formula.docx
+++ b/docs/help_formula.docx
@@ -87,26 +87,50 @@
       <w:pPr>
         <w:rPr>
           <w:rFonts w:eastAsiaTheme="minorEastAsia"/>
-          <w:lang w:val="de-DE"/>
         </w:rPr>
       </w:pPr>
-    </w:p>
-    <w:p/>
-    <w:p/>
-    <w:p/>
-    <w:p/>
-    <w:p>
-      <w:pPr>
+      <m:oMath>
+        <m:r>
+          <w:rPr>
+            <w:rFonts w:ascii="Cambria Math" w:hAnsi="Cambria Math"/>
+          </w:rPr>
+          <m:t>cos</m:t>
+        </m:r>
+        <m:f>
+          <m:fPr>
+            <m:ctrlPr>
+              <w:rPr>
+                <w:rFonts w:ascii="Cambria Math" w:hAnsi="Cambria Math"/>
+                <w:i/>
+              </w:rPr>
+            </m:ctrlPr>
+          </m:fPr>
+          <m:num>
+            <m:r>
+              <w:rPr>
+                <w:rFonts w:ascii="Cambria Math" w:hAnsi="Cambria Math"/>
+              </w:rPr>
+              <m:t>π</m:t>
+            </m:r>
+          </m:num>
+          <m:den>
+            <m:r>
+              <w:rPr>
+                <w:rFonts w:ascii="Cambria Math" w:hAnsi="Cambria Math"/>
+              </w:rPr>
+              <m:t>3</m:t>
+            </m:r>
+          </m:den>
+        </m:f>
+      </m:oMath>
+      <w:r>
         <w:rPr>
           <w:rFonts w:eastAsiaTheme="minorEastAsia"/>
         </w:rPr>
-      </w:pPr>
+        <w:t>rad</w:t>
+      </w:r>
     </w:p>
-    <w:p>
-      <w:pPr>
-        <w:jc w:val="center"/>
-      </w:pPr>
-    </w:p>
+    <w:p/>
     <w:sectPr>
       <w:pgSz w:w="11906" w:h="16838"/>
       <w:pgMar w:top="1417" w:right="1417" w:bottom="1134" w:left="1417" w:header="708" w:footer="708" w:gutter="0"/>

</xml_diff>

<commit_message>
Added new operation Percentage Change
</commit_message>
<xml_diff>
--- a/docs/help_formula.docx
+++ b/docs/help_formula.docx
@@ -129,6 +129,127 @@
         </w:rPr>
         <w:t>rad</w:t>
       </w:r>
+    </w:p>
+    <w:p>
+      <w:pPr>
+        <w:rPr>
+          <w:rFonts w:eastAsiaTheme="minorEastAsia"/>
+        </w:rPr>
+      </w:pPr>
+      <m:oMathPara>
+        <m:oMath>
+          <m:r>
+            <w:rPr>
+              <w:rFonts w:ascii="Cambria Math" w:eastAsiaTheme="minorEastAsia" w:hAnsi="Cambria Math"/>
+            </w:rPr>
+            <m:t>∆%=</m:t>
+          </m:r>
+          <m:f>
+            <m:fPr>
+              <m:ctrlPr>
+                <w:rPr>
+                  <w:rFonts w:ascii="Cambria Math" w:eastAsiaTheme="minorEastAsia" w:hAnsi="Cambria Math"/>
+                  <w:i/>
+                </w:rPr>
+              </m:ctrlPr>
+            </m:fPr>
+            <m:num>
+              <m:sSub>
+                <m:sSubPr>
+                  <m:ctrlPr>
+                    <w:rPr>
+                      <w:rFonts w:ascii="Cambria Math" w:eastAsiaTheme="minorEastAsia" w:hAnsi="Cambria Math"/>
+                      <w:i/>
+                    </w:rPr>
+                  </m:ctrlPr>
+                </m:sSubPr>
+                <m:e>
+                  <m:r>
+                    <w:rPr>
+                      <w:rFonts w:ascii="Cambria Math" w:eastAsiaTheme="minorEastAsia" w:hAnsi="Cambria Math"/>
+                    </w:rPr>
+                    <m:t>V</m:t>
+                  </m:r>
+                </m:e>
+                <m:sub>
+                  <m:r>
+                    <w:rPr>
+                      <w:rFonts w:ascii="Cambria Math" w:eastAsiaTheme="minorEastAsia" w:hAnsi="Cambria Math"/>
+                    </w:rPr>
+                    <m:t>2</m:t>
+                  </m:r>
+                </m:sub>
+              </m:sSub>
+              <m:r>
+                <w:rPr>
+                  <w:rFonts w:ascii="Cambria Math" w:eastAsiaTheme="minorEastAsia" w:hAnsi="Cambria Math"/>
+                </w:rPr>
+                <m:t>-</m:t>
+              </m:r>
+              <m:sSub>
+                <m:sSubPr>
+                  <m:ctrlPr>
+                    <w:rPr>
+                      <w:rFonts w:ascii="Cambria Math" w:eastAsiaTheme="minorEastAsia" w:hAnsi="Cambria Math"/>
+                      <w:i/>
+                    </w:rPr>
+                  </m:ctrlPr>
+                </m:sSubPr>
+                <m:e>
+                  <m:r>
+                    <w:rPr>
+                      <w:rFonts w:ascii="Cambria Math" w:eastAsiaTheme="minorEastAsia" w:hAnsi="Cambria Math"/>
+                    </w:rPr>
+                    <m:t>V</m:t>
+                  </m:r>
+                </m:e>
+                <m:sub>
+                  <m:r>
+                    <w:rPr>
+                      <w:rFonts w:ascii="Cambria Math" w:eastAsiaTheme="minorEastAsia" w:hAnsi="Cambria Math"/>
+                    </w:rPr>
+                    <m:t>1</m:t>
+                  </m:r>
+                </m:sub>
+              </m:sSub>
+            </m:num>
+            <m:den>
+              <m:sSub>
+                <m:sSubPr>
+                  <m:ctrlPr>
+                    <w:rPr>
+                      <w:rFonts w:ascii="Cambria Math" w:eastAsiaTheme="minorEastAsia" w:hAnsi="Cambria Math"/>
+                      <w:i/>
+                    </w:rPr>
+                  </m:ctrlPr>
+                </m:sSubPr>
+                <m:e>
+                  <m:r>
+                    <w:rPr>
+                      <w:rFonts w:ascii="Cambria Math" w:eastAsiaTheme="minorEastAsia" w:hAnsi="Cambria Math"/>
+                    </w:rPr>
+                    <m:t>V</m:t>
+                  </m:r>
+                </m:e>
+                <m:sub>
+                  <m:r>
+                    <w:rPr>
+                      <w:rFonts w:ascii="Cambria Math" w:eastAsiaTheme="minorEastAsia" w:hAnsi="Cambria Math"/>
+                    </w:rPr>
+                    <m:t>1</m:t>
+                  </m:r>
+                </m:sub>
+              </m:sSub>
+            </m:den>
+          </m:f>
+          <m:r>
+            <w:rPr>
+              <w:rFonts w:ascii="Cambria Math" w:eastAsiaTheme="minorEastAsia" w:hAnsi="Cambria Math"/>
+            </w:rPr>
+            <m:t>×100%</m:t>
+          </m:r>
+        </m:oMath>
+      </m:oMathPara>
     </w:p>
     <w:p/>
     <w:sectPr>

</xml_diff>

<commit_message>
Help topic added: reciprocal
</commit_message>
<xml_diff>
--- a/docs/help_formula.docx
+++ b/docs/help_formula.docx
@@ -251,7 +251,163 @@
         </m:oMath>
       </m:oMathPara>
     </w:p>
-    <w:p/>
+    <w:p>
+      <w:pPr>
+        <w:rPr>
+          <w:lang w:val="de-DE"/>
+        </w:rPr>
+      </w:pPr>
+      <w:proofErr w:type="spellStart"/>
+      <w:r>
+        <w:rPr>
+          <w:lang w:val="de-DE"/>
+        </w:rPr>
+        <w:t>Reciprocal</w:t>
+      </w:r>
+      <w:proofErr w:type="spellEnd"/>
+    </w:p>
+    <w:p>
+      <w:pPr>
+        <w:rPr>
+          <w:rFonts w:eastAsiaTheme="minorEastAsia"/>
+          <w:lang w:val="de-DE"/>
+        </w:rPr>
+      </w:pPr>
+      <m:oMathPara>
+        <m:oMath>
+          <m:f>
+            <m:fPr>
+              <m:ctrlPr>
+                <w:rPr>
+                  <w:rFonts w:ascii="Cambria Math" w:hAnsi="Cambria Math"/>
+                  <w:i/>
+                  <w:lang w:val="de-DE"/>
+                </w:rPr>
+              </m:ctrlPr>
+            </m:fPr>
+            <m:num>
+              <m:r>
+                <w:rPr>
+                  <w:rFonts w:ascii="Cambria Math" w:hAnsi="Cambria Math"/>
+                  <w:lang w:val="de-DE"/>
+                </w:rPr>
+                <m:t>1</m:t>
+              </m:r>
+            </m:num>
+            <m:den>
+              <m:f>
+                <m:fPr>
+                  <m:ctrlPr>
+                    <w:rPr>
+                      <w:rFonts w:ascii="Cambria Math" w:hAnsi="Cambria Math"/>
+                      <w:i/>
+                      <w:lang w:val="de-DE"/>
+                    </w:rPr>
+                  </m:ctrlPr>
+                </m:fPr>
+                <m:num>
+                  <m:r>
+                    <w:rPr>
+                      <w:rFonts w:ascii="Cambria Math" w:hAnsi="Cambria Math"/>
+                      <w:lang w:val="de-DE"/>
+                    </w:rPr>
+                    <m:t>1</m:t>
+                  </m:r>
+                </m:num>
+                <m:den>
+                  <m:r>
+                    <w:rPr>
+                      <w:rFonts w:ascii="Cambria Math" w:hAnsi="Cambria Math"/>
+                      <w:lang w:val="de-DE"/>
+                    </w:rPr>
+                    <m:t>2</m:t>
+                  </m:r>
+                </m:den>
+              </m:f>
+              <m:r>
+                <w:rPr>
+                  <w:rFonts w:ascii="Cambria Math" w:hAnsi="Cambria Math"/>
+                  <w:lang w:val="de-DE"/>
+                </w:rPr>
+                <m:t>-</m:t>
+              </m:r>
+              <m:f>
+                <m:fPr>
+                  <m:ctrlPr>
+                    <w:rPr>
+                      <w:rFonts w:ascii="Cambria Math" w:hAnsi="Cambria Math"/>
+                      <w:i/>
+                      <w:lang w:val="de-DE"/>
+                    </w:rPr>
+                  </m:ctrlPr>
+                </m:fPr>
+                <m:num>
+                  <m:r>
+                    <w:rPr>
+                      <w:rFonts w:ascii="Cambria Math" w:hAnsi="Cambria Math"/>
+                      <w:lang w:val="de-DE"/>
+                    </w:rPr>
+                    <m:t>1</m:t>
+                  </m:r>
+                </m:num>
+                <m:den>
+                  <m:r>
+                    <w:rPr>
+                      <w:rFonts w:ascii="Cambria Math" w:hAnsi="Cambria Math"/>
+                      <w:lang w:val="de-DE"/>
+                    </w:rPr>
+                    <m:t>3</m:t>
+                  </m:r>
+                </m:den>
+              </m:f>
+              <m:r>
+                <w:rPr>
+                  <w:rFonts w:ascii="Cambria Math" w:hAnsi="Cambria Math"/>
+                  <w:lang w:val="de-DE"/>
+                </w:rPr>
+                <m:t>+</m:t>
+              </m:r>
+              <m:f>
+                <m:fPr>
+                  <m:ctrlPr>
+                    <w:rPr>
+                      <w:rFonts w:ascii="Cambria Math" w:hAnsi="Cambria Math"/>
+                      <w:i/>
+                      <w:lang w:val="de-DE"/>
+                    </w:rPr>
+                  </m:ctrlPr>
+                </m:fPr>
+                <m:num>
+                  <m:r>
+                    <w:rPr>
+                      <w:rFonts w:ascii="Cambria Math" w:hAnsi="Cambria Math"/>
+                      <w:lang w:val="de-DE"/>
+                    </w:rPr>
+                    <m:t>1</m:t>
+                  </m:r>
+                </m:num>
+                <m:den>
+                  <m:r>
+                    <w:rPr>
+                      <w:rFonts w:ascii="Cambria Math" w:hAnsi="Cambria Math"/>
+                      <w:lang w:val="de-DE"/>
+                    </w:rPr>
+                    <m:t>4</m:t>
+                  </m:r>
+                </m:den>
+              </m:f>
+            </m:den>
+          </m:f>
+        </m:oMath>
+      </m:oMathPara>
+    </w:p>
+    <w:p>
+      <w:pPr>
+        <w:rPr>
+          <w:lang w:val="de-DE"/>
+        </w:rPr>
+      </w:pPr>
+    </w:p>
     <w:sectPr>
       <w:pgSz w:w="11906" w:h="16838"/>
       <w:pgMar w:top="1417" w:right="1417" w:bottom="1134" w:left="1417" w:header="708" w:footer="708" w:gutter="0"/>

</xml_diff>